<commit_message>
feat: polish community service app and admin flows
</commit_message>
<xml_diff>
--- a/docs/论文与开题/开题报告.docx
+++ b/docs/论文与开题/开题报告.docx
@@ -443,6 +443,7 @@
       <w:pPr>
         <w:widowControl w:val="0"/>
         <w:numPr>
+          <w:ilvl w:val="0"/>
           <w:numId w:val="0"/>
         </w:numPr>
         <w:spacing w:line="360" w:lineRule="auto"/>
@@ -469,6 +470,7 @@
       <w:pPr>
         <w:widowControl w:val="0"/>
         <w:numPr>
+          <w:ilvl w:val="0"/>
           <w:numId w:val="0"/>
         </w:numPr>
         <w:spacing w:line="360" w:lineRule="auto"/>
@@ -512,6 +514,7 @@
       <w:pPr>
         <w:widowControl w:val="0"/>
         <w:numPr>
+          <w:ilvl w:val="0"/>
           <w:numId w:val="0"/>
         </w:numPr>
         <w:spacing w:line="360" w:lineRule="auto"/>
@@ -528,6 +531,7 @@
       <w:pPr>
         <w:widowControl w:val="0"/>
         <w:numPr>
+          <w:ilvl w:val="0"/>
           <w:numId w:val="0"/>
         </w:numPr>
         <w:spacing w:line="360" w:lineRule="auto"/>
@@ -553,6 +557,7 @@
       <w:pPr>
         <w:widowControl w:val="0"/>
         <w:numPr>
+          <w:ilvl w:val="0"/>
           <w:numId w:val="0"/>
         </w:numPr>
         <w:spacing w:line="360" w:lineRule="auto"/>
@@ -605,6 +610,7 @@
       <w:pPr>
         <w:widowControl w:val="0"/>
         <w:numPr>
+          <w:ilvl w:val="0"/>
           <w:numId w:val="0"/>
         </w:numPr>
         <w:spacing w:line="360" w:lineRule="auto"/>
@@ -634,6 +640,7 @@
       <w:pPr>
         <w:widowControl w:val="0"/>
         <w:numPr>
+          <w:ilvl w:val="0"/>
           <w:numId w:val="0"/>
         </w:numPr>
         <w:pBdr>
@@ -782,6 +789,7 @@
       <w:pPr>
         <w:widowControl w:val="0"/>
         <w:numPr>
+          <w:ilvl w:val="0"/>
           <w:numId w:val="0"/>
         </w:numPr>
         <w:spacing w:line="360" w:lineRule="auto"/>
@@ -823,6 +831,7 @@
       <w:pPr>
         <w:widowControl w:val="0"/>
         <w:numPr>
+          <w:ilvl w:val="0"/>
           <w:numId w:val="0"/>
         </w:numPr>
         <w:spacing w:line="360" w:lineRule="auto"/>
@@ -843,13 +852,12 @@
         </w:rPr>
         <w:t>个人端：志愿者查看累计服务时长、服务次数、评价星级；居民查看历史发布需求及进度</w:t>
       </w:r>
-      <w:bookmarkStart w:id="0" w:name="_GoBack"/>
-      <w:bookmarkEnd w:id="0"/>
     </w:p>
     <w:p>
       <w:pPr>
         <w:widowControl w:val="0"/>
         <w:numPr>
+          <w:ilvl w:val="0"/>
           <w:numId w:val="0"/>
         </w:numPr>
         <w:spacing w:line="360" w:lineRule="auto"/>
@@ -893,6 +901,7 @@
       <w:pPr>
         <w:widowControl w:val="0"/>
         <w:numPr>
+          <w:ilvl w:val="0"/>
           <w:numId w:val="0"/>
         </w:numPr>
         <w:pBdr>
@@ -921,6 +930,7 @@
       <w:pPr>
         <w:widowControl w:val="0"/>
         <w:numPr>
+          <w:ilvl w:val="0"/>
           <w:numId w:val="0"/>
         </w:numPr>
         <w:pBdr>
@@ -974,6 +984,7 @@
       <w:pPr>
         <w:widowControl w:val="0"/>
         <w:numPr>
+          <w:ilvl w:val="0"/>
           <w:numId w:val="0"/>
         </w:numPr>
         <w:spacing w:line="360" w:lineRule="auto"/>
@@ -996,13 +1007,27 @@
           <w:szCs w:val="36"/>
           <w:lang w:val="en-US" w:eastAsia="zh-CN"/>
         </w:rPr>
-        <w:t>（1）AI 智能匹配与动态优化机制​</w:t>
+        <w:t>（1）AI 智能匹配</w:t>
+      </w:r>
+      <w:bookmarkStart w:id="0" w:name="_GoBack"/>
+      <w:bookmarkEnd w:id="0"/>
+      <w:r>
+        <w:rPr>
+          <w:rFonts w:hint="eastAsia"/>
+          <w:b/>
+          <w:bCs/>
+          <w:sz w:val="28"/>
+          <w:szCs w:val="36"/>
+          <w:lang w:val="en-US" w:eastAsia="zh-CN"/>
+        </w:rPr>
+        <w:t>与动态优化机制​</w:t>
       </w:r>
     </w:p>
     <w:p>
       <w:pPr>
         <w:widowControl w:val="0"/>
         <w:numPr>
+          <w:ilvl w:val="0"/>
           <w:numId w:val="0"/>
         </w:numPr>
         <w:spacing w:line="360" w:lineRule="auto"/>
@@ -1022,13 +1047,14 @@
           <w:szCs w:val="36"/>
           <w:lang w:val="en-US" w:eastAsia="zh-CN"/>
         </w:rPr>
-        <w:t>构建 “三维度精准匹配模型”，除志愿者历史服务类型等基础维度，新增 “能力标签权重” 与 “需求紧急度适配”，通过协同过滤算法生成 “最优志愿者推荐列表”。</w:t>
+        <w:t>构建 “三维度精准匹配模型”，除志愿者历史服务类型等基础维度，新增 “能力标签权重” 与 “需求紧急度适配”，通过多因子规则过滤算法生成 “最优志愿者推荐列表”。</w:t>
       </w:r>
     </w:p>
     <w:p>
       <w:pPr>
         <w:widowControl w:val="0"/>
         <w:numPr>
+          <w:ilvl w:val="0"/>
           <w:numId w:val="0"/>
         </w:numPr>
         <w:spacing w:line="360" w:lineRule="auto"/>
@@ -1058,12 +1084,39 @@
       <w:pPr>
         <w:widowControl w:val="0"/>
         <w:numPr>
+          <w:ilvl w:val="0"/>
           <w:numId w:val="0"/>
         </w:numPr>
         <w:spacing w:line="360" w:lineRule="auto"/>
         <w:ind w:firstLine="420" w:firstLineChars="0"/>
         <w:jc w:val="both"/>
         <w:rPr>
+          <w:rFonts w:hint="eastAsia"/>
+          <w:sz w:val="28"/>
+          <w:szCs w:val="36"/>
+          <w:lang w:val="en-US" w:eastAsia="zh-CN"/>
+        </w:rPr>
+      </w:pPr>
+      <w:r>
+        <w:rPr>
+          <w:rFonts w:hint="eastAsia"/>
+          <w:sz w:val="28"/>
+          <w:szCs w:val="36"/>
+          <w:lang w:val="en-US" w:eastAsia="zh-CN"/>
+        </w:rPr>
+        <w:t>除基础异常数据监测，新增 “需求趋势预测” 功能，分析近 3 个月需求数据预测需求高峰，向社区管理员推送 “资源储备建议”。</w:t>
+      </w:r>
+    </w:p>
+    <w:p>
+      <w:pPr>
+        <w:widowControl w:val="0"/>
+        <w:numPr>
+          <w:ilvl w:val="0"/>
+          <w:numId w:val="0"/>
+        </w:numPr>
+        <w:spacing w:line="360" w:lineRule="auto"/>
+        <w:jc w:val="both"/>
+        <w:rPr>
           <w:rFonts w:hint="default"/>
           <w:b/>
           <w:bCs/>
@@ -1072,15 +1125,6 @@
           <w:lang w:val="en-US" w:eastAsia="zh-CN"/>
         </w:rPr>
       </w:pPr>
-      <w:r>
-        <w:rPr>
-          <w:rFonts w:hint="eastAsia"/>
-          <w:sz w:val="28"/>
-          <w:szCs w:val="36"/>
-          <w:lang w:val="en-US" w:eastAsia="zh-CN"/>
-        </w:rPr>
-        <w:t>除基础异常数据监测，新增 “需求趋势预测” 功能，分析近 3 个月需求数据预测需求高峰，向社区管理员推送 “资源储备建议”。</w:t>
-      </w:r>
       <w:r>
         <w:rPr>
           <w:rFonts w:hint="eastAsia"/>
@@ -1108,6 +1152,7 @@
       <w:pPr>
         <w:widowControl w:val="0"/>
         <w:numPr>
+          <w:ilvl w:val="0"/>
           <w:numId w:val="0"/>
         </w:numPr>
         <w:spacing w:line="360" w:lineRule="auto"/>
@@ -1148,7 +1193,9 @@
         </w:tblBorders>
         <w:tblLayout w:type="autofit"/>
         <w:tblCellMar>
+          <w:top w:w="0" w:type="dxa"/>
           <w:left w:w="108" w:type="dxa"/>
+          <w:bottom w:w="0" w:type="dxa"/>
           <w:right w:w="108" w:type="dxa"/>
         </w:tblCellMar>
       </w:tblPr>
@@ -1169,7 +1216,9 @@
             <w:insideV w:val="single" w:color="auto" w:sz="4" w:space="0"/>
           </w:tblBorders>
           <w:tblCellMar>
+            <w:top w:w="0" w:type="dxa"/>
             <w:left w:w="108" w:type="dxa"/>
+            <w:bottom w:w="0" w:type="dxa"/>
             <w:right w:w="108" w:type="dxa"/>
           </w:tblCellMar>
         </w:tblPrEx>
@@ -1181,6 +1230,7 @@
             <w:pPr>
               <w:widowControl w:val="0"/>
               <w:numPr>
+                <w:ilvl w:val="0"/>
                 <w:numId w:val="0"/>
               </w:numPr>
               <w:spacing w:line="360" w:lineRule="auto"/>
@@ -1229,6 +1279,7 @@
             <w:pPr>
               <w:widowControl w:val="0"/>
               <w:numPr>
+                <w:ilvl w:val="0"/>
                 <w:numId w:val="0"/>
               </w:numPr>
               <w:spacing w:line="360" w:lineRule="auto"/>
@@ -1265,6 +1316,7 @@
             <w:pPr>
               <w:widowControl w:val="0"/>
               <w:numPr>
+                <w:ilvl w:val="0"/>
                 <w:numId w:val="0"/>
               </w:numPr>
               <w:spacing w:line="360" w:lineRule="auto"/>
@@ -1301,6 +1353,7 @@
             <w:pPr>
               <w:widowControl w:val="0"/>
               <w:numPr>
+                <w:ilvl w:val="0"/>
                 <w:numId w:val="0"/>
               </w:numPr>
               <w:spacing w:line="360" w:lineRule="auto"/>
@@ -1341,7 +1394,9 @@
             <w:insideV w:val="single" w:color="auto" w:sz="4" w:space="0"/>
           </w:tblBorders>
           <w:tblCellMar>
+            <w:top w:w="0" w:type="dxa"/>
             <w:left w:w="108" w:type="dxa"/>
+            <w:bottom w:w="0" w:type="dxa"/>
             <w:right w:w="108" w:type="dxa"/>
           </w:tblCellMar>
         </w:tblPrEx>
@@ -1353,6 +1408,7 @@
             <w:pPr>
               <w:widowControl w:val="0"/>
               <w:numPr>
+                <w:ilvl w:val="0"/>
                 <w:numId w:val="0"/>
               </w:numPr>
               <w:spacing w:line="360" w:lineRule="auto"/>
@@ -1401,6 +1457,7 @@
             <w:pPr>
               <w:widowControl w:val="0"/>
               <w:numPr>
+                <w:ilvl w:val="0"/>
                 <w:numId w:val="0"/>
               </w:numPr>
               <w:spacing w:line="360" w:lineRule="auto"/>
@@ -1437,6 +1494,7 @@
             <w:pPr>
               <w:widowControl w:val="0"/>
               <w:numPr>
+                <w:ilvl w:val="0"/>
                 <w:numId w:val="0"/>
               </w:numPr>
               <w:spacing w:line="360" w:lineRule="auto"/>
@@ -1473,6 +1531,7 @@
             <w:pPr>
               <w:widowControl w:val="0"/>
               <w:numPr>
+                <w:ilvl w:val="0"/>
                 <w:numId w:val="0"/>
               </w:numPr>
               <w:spacing w:line="360" w:lineRule="auto"/>
@@ -1501,7 +1560,9 @@
             <w:insideV w:val="single" w:color="auto" w:sz="4" w:space="0"/>
           </w:tblBorders>
           <w:tblCellMar>
+            <w:top w:w="0" w:type="dxa"/>
             <w:left w:w="108" w:type="dxa"/>
+            <w:bottom w:w="0" w:type="dxa"/>
             <w:right w:w="108" w:type="dxa"/>
           </w:tblCellMar>
         </w:tblPrEx>
@@ -1513,6 +1574,7 @@
             <w:pPr>
               <w:widowControl w:val="0"/>
               <w:numPr>
+                <w:ilvl w:val="0"/>
                 <w:numId w:val="0"/>
               </w:numPr>
               <w:spacing w:line="360" w:lineRule="auto"/>
@@ -1561,6 +1623,7 @@
             <w:pPr>
               <w:widowControl w:val="0"/>
               <w:numPr>
+                <w:ilvl w:val="0"/>
                 <w:numId w:val="0"/>
               </w:numPr>
               <w:spacing w:line="360" w:lineRule="auto"/>
@@ -1609,30 +1672,32 @@
             <w:pPr>
               <w:widowControl w:val="0"/>
               <w:numPr>
-                <w:numId w:val="0"/>
-              </w:numPr>
-              <w:spacing w:line="360" w:lineRule="auto"/>
-              <w:jc w:val="both"/>
-              <w:rPr>
-                <w:rFonts w:hint="default"/>
-                <w:b/>
-                <w:bCs/>
-                <w:sz w:val="28"/>
-                <w:szCs w:val="36"/>
-                <w:vertAlign w:val="baseline"/>
-                <w:lang w:val="en-US" w:eastAsia="zh-CN"/>
-              </w:rPr>
-            </w:pPr>
-          </w:p>
-        </w:tc>
-        <w:tc>
-          <w:tcPr>
-            <w:tcW w:w="2130" w:type="dxa"/>
-          </w:tcPr>
-          <w:p>
-            <w:pPr>
-              <w:widowControl w:val="0"/>
-              <w:numPr>
+                <w:ilvl w:val="0"/>
+                <w:numId w:val="0"/>
+              </w:numPr>
+              <w:spacing w:line="360" w:lineRule="auto"/>
+              <w:jc w:val="both"/>
+              <w:rPr>
+                <w:rFonts w:hint="default"/>
+                <w:b/>
+                <w:bCs/>
+                <w:sz w:val="28"/>
+                <w:szCs w:val="36"/>
+                <w:vertAlign w:val="baseline"/>
+                <w:lang w:val="en-US" w:eastAsia="zh-CN"/>
+              </w:rPr>
+            </w:pPr>
+          </w:p>
+        </w:tc>
+        <w:tc>
+          <w:tcPr>
+            <w:tcW w:w="2130" w:type="dxa"/>
+          </w:tcPr>
+          <w:p>
+            <w:pPr>
+              <w:widowControl w:val="0"/>
+              <w:numPr>
+                <w:ilvl w:val="0"/>
                 <w:numId w:val="0"/>
               </w:numPr>
               <w:spacing w:line="360" w:lineRule="auto"/>
@@ -1661,7 +1726,9 @@
             <w:insideV w:val="single" w:color="auto" w:sz="4" w:space="0"/>
           </w:tblBorders>
           <w:tblCellMar>
+            <w:top w:w="0" w:type="dxa"/>
             <w:left w:w="108" w:type="dxa"/>
+            <w:bottom w:w="0" w:type="dxa"/>
             <w:right w:w="108" w:type="dxa"/>
           </w:tblCellMar>
         </w:tblPrEx>
@@ -1673,6 +1740,7 @@
             <w:pPr>
               <w:widowControl w:val="0"/>
               <w:numPr>
+                <w:ilvl w:val="0"/>
                 <w:numId w:val="0"/>
               </w:numPr>
               <w:spacing w:line="360" w:lineRule="auto"/>
@@ -1709,6 +1777,7 @@
             <w:pPr>
               <w:widowControl w:val="0"/>
               <w:numPr>
+                <w:ilvl w:val="0"/>
                 <w:numId w:val="0"/>
               </w:numPr>
               <w:spacing w:line="360" w:lineRule="auto"/>
@@ -1745,6 +1814,7 @@
             <w:pPr>
               <w:widowControl w:val="0"/>
               <w:numPr>
+                <w:ilvl w:val="0"/>
                 <w:numId w:val="0"/>
               </w:numPr>
               <w:spacing w:line="360" w:lineRule="auto"/>
@@ -1781,6 +1851,7 @@
             <w:pPr>
               <w:widowControl w:val="0"/>
               <w:numPr>
+                <w:ilvl w:val="0"/>
                 <w:numId w:val="0"/>
               </w:numPr>
               <w:spacing w:line="360" w:lineRule="auto"/>
@@ -1809,7 +1880,9 @@
             <w:insideV w:val="single" w:color="auto" w:sz="4" w:space="0"/>
           </w:tblBorders>
           <w:tblCellMar>
+            <w:top w:w="0" w:type="dxa"/>
             <w:left w:w="108" w:type="dxa"/>
+            <w:bottom w:w="0" w:type="dxa"/>
             <w:right w:w="108" w:type="dxa"/>
           </w:tblCellMar>
         </w:tblPrEx>
@@ -1821,6 +1894,7 @@
             <w:pPr>
               <w:widowControl w:val="0"/>
               <w:numPr>
+                <w:ilvl w:val="0"/>
                 <w:numId w:val="0"/>
               </w:numPr>
               <w:spacing w:line="360" w:lineRule="auto"/>
@@ -1857,6 +1931,7 @@
             <w:pPr>
               <w:widowControl w:val="0"/>
               <w:numPr>
+                <w:ilvl w:val="0"/>
                 <w:numId w:val="0"/>
               </w:numPr>
               <w:spacing w:line="360" w:lineRule="auto"/>
@@ -1893,30 +1968,32 @@
             <w:pPr>
               <w:widowControl w:val="0"/>
               <w:numPr>
-                <w:numId w:val="0"/>
-              </w:numPr>
-              <w:spacing w:line="360" w:lineRule="auto"/>
-              <w:jc w:val="both"/>
-              <w:rPr>
-                <w:rFonts w:hint="default"/>
-                <w:b/>
-                <w:bCs/>
-                <w:sz w:val="28"/>
-                <w:szCs w:val="36"/>
-                <w:vertAlign w:val="baseline"/>
-                <w:lang w:val="en-US" w:eastAsia="zh-CN"/>
-              </w:rPr>
-            </w:pPr>
-          </w:p>
-        </w:tc>
-        <w:tc>
-          <w:tcPr>
-            <w:tcW w:w="2130" w:type="dxa"/>
-          </w:tcPr>
-          <w:p>
-            <w:pPr>
-              <w:widowControl w:val="0"/>
-              <w:numPr>
+                <w:ilvl w:val="0"/>
+                <w:numId w:val="0"/>
+              </w:numPr>
+              <w:spacing w:line="360" w:lineRule="auto"/>
+              <w:jc w:val="both"/>
+              <w:rPr>
+                <w:rFonts w:hint="default"/>
+                <w:b/>
+                <w:bCs/>
+                <w:sz w:val="28"/>
+                <w:szCs w:val="36"/>
+                <w:vertAlign w:val="baseline"/>
+                <w:lang w:val="en-US" w:eastAsia="zh-CN"/>
+              </w:rPr>
+            </w:pPr>
+          </w:p>
+        </w:tc>
+        <w:tc>
+          <w:tcPr>
+            <w:tcW w:w="2130" w:type="dxa"/>
+          </w:tcPr>
+          <w:p>
+            <w:pPr>
+              <w:widowControl w:val="0"/>
+              <w:numPr>
+                <w:ilvl w:val="0"/>
                 <w:numId w:val="0"/>
               </w:numPr>
               <w:spacing w:line="360" w:lineRule="auto"/>
@@ -1945,7 +2022,9 @@
             <w:insideV w:val="single" w:color="auto" w:sz="4" w:space="0"/>
           </w:tblBorders>
           <w:tblCellMar>
+            <w:top w:w="0" w:type="dxa"/>
             <w:left w:w="108" w:type="dxa"/>
+            <w:bottom w:w="0" w:type="dxa"/>
             <w:right w:w="108" w:type="dxa"/>
           </w:tblCellMar>
         </w:tblPrEx>
@@ -1957,6 +2036,7 @@
             <w:pPr>
               <w:widowControl w:val="0"/>
               <w:numPr>
+                <w:ilvl w:val="0"/>
                 <w:numId w:val="0"/>
               </w:numPr>
               <w:spacing w:line="360" w:lineRule="auto"/>
@@ -1993,6 +2073,7 @@
             <w:pPr>
               <w:widowControl w:val="0"/>
               <w:numPr>
+                <w:ilvl w:val="0"/>
                 <w:numId w:val="0"/>
               </w:numPr>
               <w:spacing w:line="360" w:lineRule="auto"/>
@@ -2029,30 +2110,32 @@
             <w:pPr>
               <w:widowControl w:val="0"/>
               <w:numPr>
-                <w:numId w:val="0"/>
-              </w:numPr>
-              <w:spacing w:line="360" w:lineRule="auto"/>
-              <w:jc w:val="both"/>
-              <w:rPr>
-                <w:rFonts w:hint="default"/>
-                <w:b/>
-                <w:bCs/>
-                <w:sz w:val="28"/>
-                <w:szCs w:val="36"/>
-                <w:vertAlign w:val="baseline"/>
-                <w:lang w:val="en-US" w:eastAsia="zh-CN"/>
-              </w:rPr>
-            </w:pPr>
-          </w:p>
-        </w:tc>
-        <w:tc>
-          <w:tcPr>
-            <w:tcW w:w="2130" w:type="dxa"/>
-          </w:tcPr>
-          <w:p>
-            <w:pPr>
-              <w:widowControl w:val="0"/>
-              <w:numPr>
+                <w:ilvl w:val="0"/>
+                <w:numId w:val="0"/>
+              </w:numPr>
+              <w:spacing w:line="360" w:lineRule="auto"/>
+              <w:jc w:val="both"/>
+              <w:rPr>
+                <w:rFonts w:hint="default"/>
+                <w:b/>
+                <w:bCs/>
+                <w:sz w:val="28"/>
+                <w:szCs w:val="36"/>
+                <w:vertAlign w:val="baseline"/>
+                <w:lang w:val="en-US" w:eastAsia="zh-CN"/>
+              </w:rPr>
+            </w:pPr>
+          </w:p>
+        </w:tc>
+        <w:tc>
+          <w:tcPr>
+            <w:tcW w:w="2130" w:type="dxa"/>
+          </w:tcPr>
+          <w:p>
+            <w:pPr>
+              <w:widowControl w:val="0"/>
+              <w:numPr>
+                <w:ilvl w:val="0"/>
                 <w:numId w:val="0"/>
               </w:numPr>
               <w:spacing w:line="360" w:lineRule="auto"/>
@@ -2081,7 +2164,9 @@
             <w:insideV w:val="single" w:color="auto" w:sz="4" w:space="0"/>
           </w:tblBorders>
           <w:tblCellMar>
+            <w:top w:w="0" w:type="dxa"/>
             <w:left w:w="108" w:type="dxa"/>
+            <w:bottom w:w="0" w:type="dxa"/>
             <w:right w:w="108" w:type="dxa"/>
           </w:tblCellMar>
         </w:tblPrEx>
@@ -2093,6 +2178,7 @@
             <w:pPr>
               <w:widowControl w:val="0"/>
               <w:numPr>
+                <w:ilvl w:val="0"/>
                 <w:numId w:val="0"/>
               </w:numPr>
               <w:spacing w:line="360" w:lineRule="auto"/>
@@ -2129,6 +2215,7 @@
             <w:pPr>
               <w:widowControl w:val="0"/>
               <w:numPr>
+                <w:ilvl w:val="0"/>
                 <w:numId w:val="0"/>
               </w:numPr>
               <w:spacing w:line="360" w:lineRule="auto"/>
@@ -2177,6 +2264,7 @@
             <w:pPr>
               <w:widowControl w:val="0"/>
               <w:numPr>
+                <w:ilvl w:val="0"/>
                 <w:numId w:val="0"/>
               </w:numPr>
               <w:spacing w:line="360" w:lineRule="auto"/>
@@ -2213,6 +2301,7 @@
             <w:pPr>
               <w:widowControl w:val="0"/>
               <w:numPr>
+                <w:ilvl w:val="0"/>
                 <w:numId w:val="0"/>
               </w:numPr>
               <w:spacing w:line="360" w:lineRule="auto"/>
@@ -2276,7 +2365,9 @@
         </w:tblBorders>
         <w:tblLayout w:type="autofit"/>
         <w:tblCellMar>
+          <w:top w:w="0" w:type="dxa"/>
           <w:left w:w="108" w:type="dxa"/>
+          <w:bottom w:w="0" w:type="dxa"/>
           <w:right w:w="108" w:type="dxa"/>
         </w:tblCellMar>
       </w:tblPr>
@@ -2297,7 +2388,9 @@
             <w:insideV w:val="single" w:color="auto" w:sz="4" w:space="0"/>
           </w:tblBorders>
           <w:tblCellMar>
+            <w:top w:w="0" w:type="dxa"/>
             <w:left w:w="108" w:type="dxa"/>
+            <w:bottom w:w="0" w:type="dxa"/>
             <w:right w:w="108" w:type="dxa"/>
           </w:tblCellMar>
         </w:tblPrEx>
@@ -2309,6 +2402,7 @@
             <w:pPr>
               <w:widowControl w:val="0"/>
               <w:numPr>
+                <w:ilvl w:val="0"/>
                 <w:numId w:val="0"/>
               </w:numPr>
               <w:spacing w:line="360" w:lineRule="auto"/>
@@ -2345,6 +2439,7 @@
             <w:pPr>
               <w:widowControl w:val="0"/>
               <w:numPr>
+                <w:ilvl w:val="0"/>
                 <w:numId w:val="0"/>
               </w:numPr>
               <w:spacing w:line="360" w:lineRule="auto"/>
@@ -2381,6 +2476,7 @@
             <w:pPr>
               <w:widowControl w:val="0"/>
               <w:numPr>
+                <w:ilvl w:val="0"/>
                 <w:numId w:val="0"/>
               </w:numPr>
               <w:spacing w:line="360" w:lineRule="auto"/>
@@ -2417,6 +2513,7 @@
             <w:pPr>
               <w:widowControl w:val="0"/>
               <w:numPr>
+                <w:ilvl w:val="0"/>
                 <w:numId w:val="0"/>
               </w:numPr>
               <w:spacing w:line="360" w:lineRule="auto"/>
@@ -2457,7 +2554,9 @@
             <w:insideV w:val="single" w:color="auto" w:sz="4" w:space="0"/>
           </w:tblBorders>
           <w:tblCellMar>
+            <w:top w:w="0" w:type="dxa"/>
             <w:left w:w="108" w:type="dxa"/>
+            <w:bottom w:w="0" w:type="dxa"/>
             <w:right w:w="108" w:type="dxa"/>
           </w:tblCellMar>
         </w:tblPrEx>
@@ -2469,6 +2568,7 @@
             <w:pPr>
               <w:widowControl w:val="0"/>
               <w:numPr>
+                <w:ilvl w:val="0"/>
                 <w:numId w:val="0"/>
               </w:numPr>
               <w:spacing w:line="360" w:lineRule="auto"/>
@@ -2505,6 +2605,7 @@
             <w:pPr>
               <w:widowControl w:val="0"/>
               <w:numPr>
+                <w:ilvl w:val="0"/>
                 <w:numId w:val="0"/>
               </w:numPr>
               <w:spacing w:line="360" w:lineRule="auto"/>
@@ -2553,6 +2654,7 @@
             <w:pPr>
               <w:widowControl w:val="0"/>
               <w:numPr>
+                <w:ilvl w:val="0"/>
                 <w:numId w:val="0"/>
               </w:numPr>
               <w:spacing w:line="360" w:lineRule="auto"/>
@@ -2589,6 +2691,7 @@
             <w:pPr>
               <w:widowControl w:val="0"/>
               <w:numPr>
+                <w:ilvl w:val="0"/>
                 <w:numId w:val="0"/>
               </w:numPr>
               <w:spacing w:line="360" w:lineRule="auto"/>
@@ -2617,7 +2720,9 @@
             <w:insideV w:val="single" w:color="auto" w:sz="4" w:space="0"/>
           </w:tblBorders>
           <w:tblCellMar>
+            <w:top w:w="0" w:type="dxa"/>
             <w:left w:w="108" w:type="dxa"/>
+            <w:bottom w:w="0" w:type="dxa"/>
             <w:right w:w="108" w:type="dxa"/>
           </w:tblCellMar>
         </w:tblPrEx>
@@ -2629,6 +2734,7 @@
             <w:pPr>
               <w:widowControl w:val="0"/>
               <w:numPr>
+                <w:ilvl w:val="0"/>
                 <w:numId w:val="0"/>
               </w:numPr>
               <w:spacing w:line="360" w:lineRule="auto"/>
@@ -2665,6 +2771,7 @@
             <w:pPr>
               <w:widowControl w:val="0"/>
               <w:numPr>
+                <w:ilvl w:val="0"/>
                 <w:numId w:val="0"/>
               </w:numPr>
               <w:spacing w:line="360" w:lineRule="auto"/>
@@ -2701,30 +2808,32 @@
             <w:pPr>
               <w:widowControl w:val="0"/>
               <w:numPr>
-                <w:numId w:val="0"/>
-              </w:numPr>
-              <w:spacing w:line="360" w:lineRule="auto"/>
-              <w:jc w:val="both"/>
-              <w:rPr>
-                <w:rFonts w:hint="default"/>
-                <w:b/>
-                <w:bCs/>
-                <w:sz w:val="28"/>
-                <w:szCs w:val="36"/>
-                <w:vertAlign w:val="baseline"/>
-                <w:lang w:val="en-US" w:eastAsia="zh-CN"/>
-              </w:rPr>
-            </w:pPr>
-          </w:p>
-        </w:tc>
-        <w:tc>
-          <w:tcPr>
-            <w:tcW w:w="2130" w:type="dxa"/>
-          </w:tcPr>
-          <w:p>
-            <w:pPr>
-              <w:widowControl w:val="0"/>
-              <w:numPr>
+                <w:ilvl w:val="0"/>
+                <w:numId w:val="0"/>
+              </w:numPr>
+              <w:spacing w:line="360" w:lineRule="auto"/>
+              <w:jc w:val="both"/>
+              <w:rPr>
+                <w:rFonts w:hint="default"/>
+                <w:b/>
+                <w:bCs/>
+                <w:sz w:val="28"/>
+                <w:szCs w:val="36"/>
+                <w:vertAlign w:val="baseline"/>
+                <w:lang w:val="en-US" w:eastAsia="zh-CN"/>
+              </w:rPr>
+            </w:pPr>
+          </w:p>
+        </w:tc>
+        <w:tc>
+          <w:tcPr>
+            <w:tcW w:w="2130" w:type="dxa"/>
+          </w:tcPr>
+          <w:p>
+            <w:pPr>
+              <w:widowControl w:val="0"/>
+              <w:numPr>
+                <w:ilvl w:val="0"/>
                 <w:numId w:val="0"/>
               </w:numPr>
               <w:spacing w:line="360" w:lineRule="auto"/>
@@ -2753,7 +2862,9 @@
             <w:insideV w:val="single" w:color="auto" w:sz="4" w:space="0"/>
           </w:tblBorders>
           <w:tblCellMar>
+            <w:top w:w="0" w:type="dxa"/>
             <w:left w:w="108" w:type="dxa"/>
+            <w:bottom w:w="0" w:type="dxa"/>
             <w:right w:w="108" w:type="dxa"/>
           </w:tblCellMar>
         </w:tblPrEx>
@@ -2765,6 +2876,7 @@
             <w:pPr>
               <w:widowControl w:val="0"/>
               <w:numPr>
+                <w:ilvl w:val="0"/>
                 <w:numId w:val="0"/>
               </w:numPr>
               <w:spacing w:line="360" w:lineRule="auto"/>
@@ -2801,6 +2913,7 @@
             <w:pPr>
               <w:widowControl w:val="0"/>
               <w:numPr>
+                <w:ilvl w:val="0"/>
                 <w:numId w:val="0"/>
               </w:numPr>
               <w:spacing w:line="360" w:lineRule="auto"/>
@@ -2837,6 +2950,7 @@
             <w:pPr>
               <w:widowControl w:val="0"/>
               <w:numPr>
+                <w:ilvl w:val="0"/>
                 <w:numId w:val="0"/>
               </w:numPr>
               <w:spacing w:line="360" w:lineRule="auto"/>
@@ -2873,6 +2987,7 @@
             <w:pPr>
               <w:widowControl w:val="0"/>
               <w:numPr>
+                <w:ilvl w:val="0"/>
                 <w:numId w:val="0"/>
               </w:numPr>
               <w:spacing w:line="360" w:lineRule="auto"/>
@@ -2901,7 +3016,9 @@
             <w:insideV w:val="single" w:color="auto" w:sz="4" w:space="0"/>
           </w:tblBorders>
           <w:tblCellMar>
+            <w:top w:w="0" w:type="dxa"/>
             <w:left w:w="108" w:type="dxa"/>
+            <w:bottom w:w="0" w:type="dxa"/>
             <w:right w:w="108" w:type="dxa"/>
           </w:tblCellMar>
         </w:tblPrEx>
@@ -2913,6 +3030,7 @@
             <w:pPr>
               <w:widowControl w:val="0"/>
               <w:numPr>
+                <w:ilvl w:val="0"/>
                 <w:numId w:val="0"/>
               </w:numPr>
               <w:spacing w:line="360" w:lineRule="auto"/>
@@ -2949,6 +3067,7 @@
             <w:pPr>
               <w:widowControl w:val="0"/>
               <w:numPr>
+                <w:ilvl w:val="0"/>
                 <w:numId w:val="0"/>
               </w:numPr>
               <w:spacing w:line="360" w:lineRule="auto"/>
@@ -2985,30 +3104,32 @@
             <w:pPr>
               <w:widowControl w:val="0"/>
               <w:numPr>
-                <w:numId w:val="0"/>
-              </w:numPr>
-              <w:spacing w:line="360" w:lineRule="auto"/>
-              <w:jc w:val="both"/>
-              <w:rPr>
-                <w:rFonts w:hint="default"/>
-                <w:b/>
-                <w:bCs/>
-                <w:sz w:val="28"/>
-                <w:szCs w:val="36"/>
-                <w:vertAlign w:val="baseline"/>
-                <w:lang w:val="en-US" w:eastAsia="zh-CN"/>
-              </w:rPr>
-            </w:pPr>
-          </w:p>
-        </w:tc>
-        <w:tc>
-          <w:tcPr>
-            <w:tcW w:w="2130" w:type="dxa"/>
-          </w:tcPr>
-          <w:p>
-            <w:pPr>
-              <w:widowControl w:val="0"/>
-              <w:numPr>
+                <w:ilvl w:val="0"/>
+                <w:numId w:val="0"/>
+              </w:numPr>
+              <w:spacing w:line="360" w:lineRule="auto"/>
+              <w:jc w:val="both"/>
+              <w:rPr>
+                <w:rFonts w:hint="default"/>
+                <w:b/>
+                <w:bCs/>
+                <w:sz w:val="28"/>
+                <w:szCs w:val="36"/>
+                <w:vertAlign w:val="baseline"/>
+                <w:lang w:val="en-US" w:eastAsia="zh-CN"/>
+              </w:rPr>
+            </w:pPr>
+          </w:p>
+        </w:tc>
+        <w:tc>
+          <w:tcPr>
+            <w:tcW w:w="2130" w:type="dxa"/>
+          </w:tcPr>
+          <w:p>
+            <w:pPr>
+              <w:widowControl w:val="0"/>
+              <w:numPr>
+                <w:ilvl w:val="0"/>
                 <w:numId w:val="0"/>
               </w:numPr>
               <w:spacing w:line="360" w:lineRule="auto"/>
@@ -3037,7 +3158,9 @@
             <w:insideV w:val="single" w:color="auto" w:sz="4" w:space="0"/>
           </w:tblBorders>
           <w:tblCellMar>
+            <w:top w:w="0" w:type="dxa"/>
             <w:left w:w="108" w:type="dxa"/>
+            <w:bottom w:w="0" w:type="dxa"/>
             <w:right w:w="108" w:type="dxa"/>
           </w:tblCellMar>
         </w:tblPrEx>
@@ -3049,6 +3172,7 @@
             <w:pPr>
               <w:widowControl w:val="0"/>
               <w:numPr>
+                <w:ilvl w:val="0"/>
                 <w:numId w:val="0"/>
               </w:numPr>
               <w:spacing w:line="360" w:lineRule="auto"/>
@@ -3085,6 +3209,7 @@
             <w:pPr>
               <w:widowControl w:val="0"/>
               <w:numPr>
+                <w:ilvl w:val="0"/>
                 <w:numId w:val="0"/>
               </w:numPr>
               <w:spacing w:line="360" w:lineRule="auto"/>
@@ -3121,30 +3246,32 @@
             <w:pPr>
               <w:widowControl w:val="0"/>
               <w:numPr>
-                <w:numId w:val="0"/>
-              </w:numPr>
-              <w:spacing w:line="360" w:lineRule="auto"/>
-              <w:jc w:val="both"/>
-              <w:rPr>
-                <w:rFonts w:hint="default"/>
-                <w:b/>
-                <w:bCs/>
-                <w:sz w:val="28"/>
-                <w:szCs w:val="36"/>
-                <w:vertAlign w:val="baseline"/>
-                <w:lang w:val="en-US" w:eastAsia="zh-CN"/>
-              </w:rPr>
-            </w:pPr>
-          </w:p>
-        </w:tc>
-        <w:tc>
-          <w:tcPr>
-            <w:tcW w:w="2130" w:type="dxa"/>
-          </w:tcPr>
-          <w:p>
-            <w:pPr>
-              <w:widowControl w:val="0"/>
-              <w:numPr>
+                <w:ilvl w:val="0"/>
+                <w:numId w:val="0"/>
+              </w:numPr>
+              <w:spacing w:line="360" w:lineRule="auto"/>
+              <w:jc w:val="both"/>
+              <w:rPr>
+                <w:rFonts w:hint="default"/>
+                <w:b/>
+                <w:bCs/>
+                <w:sz w:val="28"/>
+                <w:szCs w:val="36"/>
+                <w:vertAlign w:val="baseline"/>
+                <w:lang w:val="en-US" w:eastAsia="zh-CN"/>
+              </w:rPr>
+            </w:pPr>
+          </w:p>
+        </w:tc>
+        <w:tc>
+          <w:tcPr>
+            <w:tcW w:w="2130" w:type="dxa"/>
+          </w:tcPr>
+          <w:p>
+            <w:pPr>
+              <w:widowControl w:val="0"/>
+              <w:numPr>
+                <w:ilvl w:val="0"/>
                 <w:numId w:val="0"/>
               </w:numPr>
               <w:spacing w:line="360" w:lineRule="auto"/>
@@ -3173,7 +3300,9 @@
             <w:insideV w:val="single" w:color="auto" w:sz="4" w:space="0"/>
           </w:tblBorders>
           <w:tblCellMar>
+            <w:top w:w="0" w:type="dxa"/>
             <w:left w:w="108" w:type="dxa"/>
+            <w:bottom w:w="0" w:type="dxa"/>
             <w:right w:w="108" w:type="dxa"/>
           </w:tblCellMar>
         </w:tblPrEx>
@@ -3185,6 +3314,7 @@
             <w:pPr>
               <w:widowControl w:val="0"/>
               <w:numPr>
+                <w:ilvl w:val="0"/>
                 <w:numId w:val="0"/>
               </w:numPr>
               <w:spacing w:line="360" w:lineRule="auto"/>
@@ -3233,6 +3363,7 @@
             <w:pPr>
               <w:widowControl w:val="0"/>
               <w:numPr>
+                <w:ilvl w:val="0"/>
                 <w:numId w:val="0"/>
               </w:numPr>
               <w:spacing w:line="360" w:lineRule="auto"/>
@@ -3269,30 +3400,32 @@
             <w:pPr>
               <w:widowControl w:val="0"/>
               <w:numPr>
-                <w:numId w:val="0"/>
-              </w:numPr>
-              <w:spacing w:line="360" w:lineRule="auto"/>
-              <w:jc w:val="both"/>
-              <w:rPr>
-                <w:rFonts w:hint="default"/>
-                <w:b/>
-                <w:bCs/>
-                <w:sz w:val="28"/>
-                <w:szCs w:val="36"/>
-                <w:vertAlign w:val="baseline"/>
-                <w:lang w:val="en-US" w:eastAsia="zh-CN"/>
-              </w:rPr>
-            </w:pPr>
-          </w:p>
-        </w:tc>
-        <w:tc>
-          <w:tcPr>
-            <w:tcW w:w="2130" w:type="dxa"/>
-          </w:tcPr>
-          <w:p>
-            <w:pPr>
-              <w:widowControl w:val="0"/>
-              <w:numPr>
+                <w:ilvl w:val="0"/>
+                <w:numId w:val="0"/>
+              </w:numPr>
+              <w:spacing w:line="360" w:lineRule="auto"/>
+              <w:jc w:val="both"/>
+              <w:rPr>
+                <w:rFonts w:hint="default"/>
+                <w:b/>
+                <w:bCs/>
+                <w:sz w:val="28"/>
+                <w:szCs w:val="36"/>
+                <w:vertAlign w:val="baseline"/>
+                <w:lang w:val="en-US" w:eastAsia="zh-CN"/>
+              </w:rPr>
+            </w:pPr>
+          </w:p>
+        </w:tc>
+        <w:tc>
+          <w:tcPr>
+            <w:tcW w:w="2130" w:type="dxa"/>
+          </w:tcPr>
+          <w:p>
+            <w:pPr>
+              <w:widowControl w:val="0"/>
+              <w:numPr>
+                <w:ilvl w:val="0"/>
                 <w:numId w:val="0"/>
               </w:numPr>
               <w:spacing w:line="360" w:lineRule="auto"/>
@@ -3315,6 +3448,7 @@
       <w:pPr>
         <w:widowControl w:val="0"/>
         <w:numPr>
+          <w:ilvl w:val="0"/>
           <w:numId w:val="0"/>
         </w:numPr>
         <w:spacing w:line="360" w:lineRule="auto"/>
@@ -3363,6 +3497,7 @@
       <w:pPr>
         <w:widowControl w:val="0"/>
         <w:numPr>
+          <w:ilvl w:val="0"/>
           <w:numId w:val="0"/>
         </w:numPr>
         <w:spacing w:line="360" w:lineRule="auto"/>
@@ -3438,6 +3573,14 @@
           <w:lang w:val="en-US" w:eastAsia="zh-CN"/>
         </w:rPr>
         <w:tab/>
+      </w:r>
+      <w:r>
+        <w:rPr>
+          <w:rFonts w:hint="eastAsia"/>
+          <w:sz w:val="28"/>
+          <w:szCs w:val="36"/>
+          <w:lang w:val="en-US" w:eastAsia="zh-CN"/>
+        </w:rPr>
         <w:t>2.</w:t>
       </w:r>
       <w:r>
@@ -3656,7 +3799,7 @@
     <w:lsdException w:qFormat="1" w:unhideWhenUsed="0" w:uiPriority="0" w:semiHidden="0" w:name="Title"/>
     <w:lsdException w:unhideWhenUsed="0" w:uiPriority="0" w:semiHidden="0" w:name="Closing"/>
     <w:lsdException w:unhideWhenUsed="0" w:uiPriority="0" w:semiHidden="0" w:name="Signature"/>
-    <w:lsdException w:unhideWhenUsed="0" w:uiPriority="0" w:name="Default Paragraph Font"/>
+    <w:lsdException w:qFormat="1" w:unhideWhenUsed="0" w:uiPriority="0" w:name="Default Paragraph Font"/>
     <w:lsdException w:unhideWhenUsed="0" w:uiPriority="0" w:semiHidden="0" w:name="Body Text"/>
     <w:lsdException w:unhideWhenUsed="0" w:uiPriority="0" w:semiHidden="0" w:name="Body Text Indent"/>
     <w:lsdException w:unhideWhenUsed="0" w:uiPriority="0" w:semiHidden="0" w:name="List Continue"/>
@@ -3694,7 +3837,7 @@
     <w:lsdException w:unhideWhenUsed="0" w:uiPriority="0" w:semiHidden="0" w:name="HTML Sample"/>
     <w:lsdException w:unhideWhenUsed="0" w:uiPriority="0" w:semiHidden="0" w:name="HTML Typewriter"/>
     <w:lsdException w:unhideWhenUsed="0" w:uiPriority="0" w:semiHidden="0" w:name="HTML Variable"/>
-    <w:lsdException w:unhideWhenUsed="0" w:uiPriority="0" w:name="Normal Table"/>
+    <w:lsdException w:qFormat="1" w:unhideWhenUsed="0" w:uiPriority="0" w:name="Normal Table"/>
     <w:lsdException w:unhideWhenUsed="0" w:uiPriority="0" w:semiHidden="0" w:name="annotation subject"/>
     <w:lsdException w:unhideWhenUsed="0" w:uiPriority="0" w:semiHidden="0" w:name="Table Simple 1"/>
     <w:lsdException w:unhideWhenUsed="0" w:uiPriority="0" w:semiHidden="0" w:name="Table Simple 2"/>
@@ -3739,7 +3882,7 @@
     <w:lsdException w:unhideWhenUsed="0" w:uiPriority="0" w:semiHidden="0" w:name="Table Web 2"/>
     <w:lsdException w:unhideWhenUsed="0" w:uiPriority="0" w:semiHidden="0" w:name="Table Web 3"/>
     <w:lsdException w:unhideWhenUsed="0" w:uiPriority="0" w:semiHidden="0" w:name="Balloon Text"/>
-    <w:lsdException w:unhideWhenUsed="0" w:uiPriority="0" w:semiHidden="0" w:name="Table Grid"/>
+    <w:lsdException w:qFormat="1" w:unhideWhenUsed="0" w:uiPriority="0" w:semiHidden="0" w:name="Table Grid"/>
     <w:lsdException w:unhideWhenUsed="0" w:uiPriority="0" w:semiHidden="0" w:name="Table Theme"/>
     <w:lsdException w:unhideWhenUsed="0" w:uiPriority="60" w:semiHidden="0" w:name="Light Shading"/>
     <w:lsdException w:unhideWhenUsed="0" w:uiPriority="61" w:semiHidden="0" w:name="Light List"/>
@@ -3859,11 +4002,13 @@
   <w:style w:type="character" w:default="1" w:styleId="4">
     <w:name w:val="Default Paragraph Font"/>
     <w:semiHidden/>
+    <w:qFormat/>
     <w:uiPriority w:val="0"/>
   </w:style>
   <w:style w:type="table" w:default="1" w:styleId="2">
     <w:name w:val="Normal Table"/>
     <w:semiHidden/>
+    <w:qFormat/>
     <w:uiPriority w:val="0"/>
     <w:tblPr>
       <w:tblCellMar>
@@ -3877,6 +4022,7 @@
   <w:style w:type="table" w:styleId="3">
     <w:name w:val="Table Grid"/>
     <w:basedOn w:val="2"/>
+    <w:qFormat/>
     <w:uiPriority w:val="0"/>
     <w:pPr>
       <w:widowControl w:val="0"/>

</xml_diff>